<commit_message>
Correct degree to BSc (Hons)
</commit_message>
<xml_diff>
--- a/resume.docx
+++ b/resume.docx
@@ -56,7 +56,7 @@
         <w:spacing w:after="60"/>
         <w:jc w:val="center"/>
       </w:pPr>
-      <w:hyperlink w:history="1" r:id="rIdyvvr32wvcs8vme2pzq2op">
+      <w:hyperlink w:history="1" r:id="rIdxh9i4j9milgctlbandpfj">
         <w:r>
           <w:rPr>
             <w:rFonts w:ascii="Arial" w:cs="Arial" w:eastAsia="Arial" w:hAnsi="Arial"/>
@@ -76,7 +76,7 @@
         </w:rPr>
         <w:t xml:space="preserve">  |  </w:t>
       </w:r>
-      <w:hyperlink w:history="1" r:id="rIdasebsr0j73zs3u-bli1a4">
+      <w:hyperlink w:history="1" r:id="rIdk46pzzzdey4trzw5q10sa">
         <w:r>
           <w:rPr>
             <w:rFonts w:ascii="Arial" w:cs="Arial" w:eastAsia="Arial" w:hAnsi="Arial"/>
@@ -96,7 +96,7 @@
         </w:rPr>
         <w:t xml:space="preserve">  |  </w:t>
       </w:r>
-      <w:hyperlink w:history="1" r:id="rIdejp3be20kubgj_divlmbq">
+      <w:hyperlink w:history="1" r:id="rIdatjznqeohqgk7e1gctdds">
         <w:r>
           <w:rPr>
             <w:rFonts w:ascii="Arial" w:cs="Arial" w:eastAsia="Arial" w:hAnsi="Arial"/>
@@ -116,7 +116,7 @@
         </w:rPr>
         <w:t xml:space="preserve">  |  </w:t>
       </w:r>
-      <w:hyperlink w:history="1" r:id="rIdpzktmgycjiuadggdkbadx">
+      <w:hyperlink w:history="1" r:id="rIdq9izkw8iywsisgeway7kh">
         <w:r>
           <w:rPr>
             <w:rFonts w:ascii="Arial" w:cs="Arial" w:eastAsia="Arial" w:hAnsi="Arial"/>
@@ -935,7 +935,7 @@
         </w:rPr>
         <w:t xml:space="preserve">	</w:t>
       </w:r>
-      <w:hyperlink w:history="1" r:id="rId7mi2dejchlaubklkqzous">
+      <w:hyperlink w:history="1" r:id="rId7d7aacdwky-jdrd-g6ohn">
         <w:r>
           <w:rPr>
             <w:rFonts w:ascii="Arial" w:cs="Arial" w:eastAsia="Arial" w:hAnsi="Arial"/>
@@ -1008,7 +1008,7 @@
         </w:rPr>
         <w:t xml:space="preserve">	</w:t>
       </w:r>
-      <w:hyperlink w:history="1" r:id="rId5uolvnwn9qx4u-qrncxcr">
+      <w:hyperlink w:history="1" r:id="rId0t2ggfexogawhrb89zw6y">
         <w:r>
           <w:rPr>
             <w:rFonts w:ascii="Arial" w:cs="Arial" w:eastAsia="Arial" w:hAnsi="Arial"/>
@@ -1091,7 +1091,7 @@
           <w:sz w:val="20"/>
           <w:szCs w:val="20"/>
         </w:rPr>
-        <w:t xml:space="preserve">BEng (Hons) Computing (Software Engineering)</w:t>
+        <w:t xml:space="preserve">BSc (Hons) Computing (Software Engineering)</w:t>
       </w:r>
       <w:r>
         <w:rPr>

</xml_diff>

<commit_message>
Rewrite docs in plainer language
</commit_message>
<xml_diff>
--- a/resume.docx
+++ b/resume.docx
@@ -56,7 +56,7 @@
         <w:spacing w:after="60"/>
         <w:jc w:val="center"/>
       </w:pPr>
-      <w:hyperlink w:history="1" r:id="rIdxh9i4j9milgctlbandpfj">
+      <w:hyperlink w:history="1" r:id="rId4be69eu8zi0za3y3ie1h0">
         <w:r>
           <w:rPr>
             <w:rFonts w:ascii="Arial" w:cs="Arial" w:eastAsia="Arial" w:hAnsi="Arial"/>
@@ -76,7 +76,7 @@
         </w:rPr>
         <w:t xml:space="preserve">  |  </w:t>
       </w:r>
-      <w:hyperlink w:history="1" r:id="rIdk46pzzzdey4trzw5q10sa">
+      <w:hyperlink w:history="1" r:id="rId5vmk4oaoweltngyzv2yfa">
         <w:r>
           <w:rPr>
             <w:rFonts w:ascii="Arial" w:cs="Arial" w:eastAsia="Arial" w:hAnsi="Arial"/>
@@ -96,7 +96,7 @@
         </w:rPr>
         <w:t xml:space="preserve">  |  </w:t>
       </w:r>
-      <w:hyperlink w:history="1" r:id="rIdatjznqeohqgk7e1gctdds">
+      <w:hyperlink w:history="1" r:id="rIdze8kp5hfnehtt-esarekj">
         <w:r>
           <w:rPr>
             <w:rFonts w:ascii="Arial" w:cs="Arial" w:eastAsia="Arial" w:hAnsi="Arial"/>
@@ -116,7 +116,7 @@
         </w:rPr>
         <w:t xml:space="preserve">  |  </w:t>
       </w:r>
-      <w:hyperlink w:history="1" r:id="rIdq9izkw8iywsisgeway7kh">
+      <w:hyperlink w:history="1" r:id="rIdhgxpbb8kifo9mn_rxkyli">
         <w:r>
           <w:rPr>
             <w:rFonts w:ascii="Arial" w:cs="Arial" w:eastAsia="Arial" w:hAnsi="Arial"/>
@@ -158,7 +158,7 @@
           <w:sz w:val="19"/>
           <w:szCs w:val="19"/>
         </w:rPr>
-        <w:t xml:space="preserve">Backend-focused software engineer with almost 4 years building production Laravel and Symfony applications. Most recently owned the payment system behind a cloud-services portal (eSewa, HBL), through which every purchase on the platform flowed. Comfortable from Livewire and jQuery front ends to Nginx, Apache and Linux servers; building DevOps skills through a Docker homelab.</w:t>
+        <w:t xml:space="preserve">Backend developer with almost 4 years of Laravel and Symfony experience. In my last role I looked after the payment service of a cloud portal (eSewa, HBL), which handled every purchase on the site. I also work on front ends with Livewire and jQuery, set up Linux servers with Nginx and Apache, and run a Docker server at home to learn more DevOps.</w:t>
       </w:r>
     </w:p>
     <w:p>
@@ -367,7 +367,7 @@
           <w:sz w:val="19"/>
           <w:szCs w:val="19"/>
         </w:rPr>
-        <w:t xml:space="preserve">Built a self-hosted Docker homelab and rebuilt my portfolio site with a CI deployment pipeline (see Projects).</w:t>
+        <w:t xml:space="preserve">Set up a Docker server at home and rebuilt my portfolio site with automatic deployment from GitHub (see Projects).</w:t>
       </w:r>
     </w:p>
     <w:p>
@@ -438,7 +438,7 @@
           <w:sz w:val="19"/>
           <w:szCs w:val="19"/>
         </w:rPr>
-        <w:t xml:space="preserve">Owned the </w:t>
+        <w:t xml:space="preserve">Looked after the </w:t>
       </w:r>
       <w:r>
         <w:rPr>
@@ -456,7 +456,7 @@
           <w:sz w:val="19"/>
           <w:szCs w:val="19"/>
         </w:rPr>
-        <w:t xml:space="preserve"> of a cloud self-service portal in a two-person backend team; every purchase (VPS, domains, endpoints, email) went through it.</w:t>
+        <w:t xml:space="preserve"> of a cloud self-service portal as one of two backend developers. Every purchase (VPS, domains, endpoints, email) went through it.</w:t>
       </w:r>
     </w:p>
     <w:p>
@@ -474,7 +474,7 @@
           <w:sz w:val="19"/>
           <w:szCs w:val="19"/>
         </w:rPr>
-        <w:t xml:space="preserve">Integrated the </w:t>
+        <w:t xml:space="preserve">Integrated </w:t>
       </w:r>
       <w:r>
         <w:rPr>
@@ -510,7 +510,7 @@
           <w:sz w:val="19"/>
           <w:szCs w:val="19"/>
         </w:rPr>
-        <w:t xml:space="preserve"> payment gateways, handling transaction recording, gateway callbacks, payment verification and invoice generation.</w:t>
+        <w:t xml:space="preserve">: recording transactions, handling gateway callbacks, verifying payments and generating invoices.</w:t>
       </w:r>
     </w:p>
     <w:p>
@@ -528,7 +528,7 @@
           <w:sz w:val="19"/>
           <w:szCs w:val="19"/>
         </w:rPr>
-        <w:t xml:space="preserve">Designed and prototyped a reward-points system that let customers spend points on portal products.</w:t>
+        <w:t xml:space="preserve">Designed and built a prototype of a reward-points system where customers could spend points on portal products.</w:t>
       </w:r>
     </w:p>
     <w:p>
@@ -546,7 +546,7 @@
           <w:sz w:val="19"/>
           <w:szCs w:val="19"/>
         </w:rPr>
-        <w:t xml:space="preserve">Built Laravel integrations with the </w:t>
+        <w:t xml:space="preserve">Used the </w:t>
       </w:r>
       <w:r>
         <w:rPr>
@@ -564,7 +564,7 @@
           <w:sz w:val="19"/>
           <w:szCs w:val="19"/>
         </w:rPr>
-        <w:t xml:space="preserve"> to provision and modify customer VMs and show live VM stats on dashboards.</w:t>
+        <w:t xml:space="preserve"> from Laravel to create and change customer VMs and show live VM stats on their dashboards.</w:t>
       </w:r>
     </w:p>
     <w:p>
@@ -582,7 +582,7 @@
           <w:sz w:val="19"/>
           <w:szCs w:val="19"/>
         </w:rPr>
-        <w:t xml:space="preserve">Automated hosting, email and domain products via the </w:t>
+        <w:t xml:space="preserve">Automated hosting, email and domain products with the </w:t>
       </w:r>
       <w:r>
         <w:rPr>
@@ -636,7 +636,7 @@
           <w:sz w:val="19"/>
           <w:szCs w:val="19"/>
         </w:rPr>
-        <w:t xml:space="preserve">Deployed apps on Linux servers (Nginx, Apache); gathered requirements from banking and education clients.</w:t>
+        <w:t xml:space="preserve">Deployed apps to Linux servers (Nginx, Apache) and gathered requirements from banking and education clients.</w:t>
       </w:r>
     </w:p>
     <w:p>
@@ -707,7 +707,7 @@
           <w:sz w:val="19"/>
           <w:szCs w:val="19"/>
         </w:rPr>
-        <w:t xml:space="preserve">Developed and maintained backend services and REST APIs in Core PHP and Laravel for web and mobile clients.</w:t>
+        <w:t xml:space="preserve">Built and maintained REST APIs in plain PHP and Laravel for web and mobile apps.</w:t>
       </w:r>
     </w:p>
     <w:p>
@@ -743,7 +743,7 @@
           <w:sz w:val="19"/>
           <w:szCs w:val="19"/>
         </w:rPr>
-        <w:t xml:space="preserve">Designed and normalised MySQL schemas, optimised slow queries and took part in code reviews.</w:t>
+        <w:t xml:space="preserve">Designed MySQL schemas, sped up slow queries and reviewed code.</w:t>
       </w:r>
     </w:p>
     <w:p>
@@ -850,7 +850,7 @@
           <w:sz w:val="19"/>
           <w:szCs w:val="19"/>
         </w:rPr>
-        <w:t xml:space="preserve"> into ramailogames.com, an online gaming platform, and turned it into a PWA.</w:t>
+        <w:t xml:space="preserve"> into ramailogames.com, an online gaming site, and turned it into a PWA.</w:t>
       </w:r>
     </w:p>
     <w:p>
@@ -868,7 +868,7 @@
           <w:sz w:val="19"/>
           <w:szCs w:val="19"/>
         </w:rPr>
-        <w:t xml:space="preserve">Contributed to the backends of an e-sports tournament platform and a video streaming service (Laravel, Symfony).</w:t>
+        <w:t xml:space="preserve">Worked on the backends of an e-sports tournament site and a video streaming service (Laravel, Symfony).</w:t>
       </w:r>
     </w:p>
     <w:p>
@@ -886,7 +886,7 @@
           <w:sz w:val="19"/>
           <w:szCs w:val="19"/>
         </w:rPr>
-        <w:t xml:space="preserve">Wrote Python scripts for web scraping and data processing, and designed database models (ERDs) for new systems.</w:t>
+        <w:t xml:space="preserve">Wrote Python scripts for web scraping and data processing, and drew up database designs (ERDs) for new systems.</w:t>
       </w:r>
     </w:p>
     <w:p>
@@ -935,7 +935,7 @@
         </w:rPr>
         <w:t xml:space="preserve">	</w:t>
       </w:r>
-      <w:hyperlink w:history="1" r:id="rId7d7aacdwky-jdrd-g6ohn">
+      <w:hyperlink w:history="1" r:id="rId_ojl-cfkhbhy-czbs5xim">
         <w:r>
           <w:rPr>
             <w:rFonts w:ascii="Arial" w:cs="Arial" w:eastAsia="Arial" w:hAnsi="Arial"/>
@@ -979,7 +979,7 @@
           <w:sz w:val="19"/>
           <w:szCs w:val="19"/>
         </w:rPr>
-        <w:t xml:space="preserve">Turned an old laptop into a headless server running Pi-hole (network-wide ad blocking), Jellyfin and Portainer in Docker, reachable remotely over Tailscale without opening router ports.</w:t>
+        <w:t xml:space="preserve">An old laptop running Pi-hole (ad blocking for the whole network), Jellyfin and Portainer in Docker. I reach it over Tailscale, so no router ports are open.</w:t>
       </w:r>
     </w:p>
     <w:p>
@@ -1008,7 +1008,7 @@
         </w:rPr>
         <w:t xml:space="preserve">	</w:t>
       </w:r>
-      <w:hyperlink w:history="1" r:id="rId0t2ggfexogawhrb89zw6y">
+      <w:hyperlink w:history="1" r:id="rIduln5hg33mnlerbbdoemqq">
         <w:r>
           <w:rPr>
             <w:rFonts w:ascii="Arial" w:cs="Arial" w:eastAsia="Arial" w:hAnsi="Arial"/>
@@ -1052,7 +1052,7 @@
           <w:sz w:val="19"/>
           <w:szCs w:val="19"/>
         </w:rPr>
-        <w:t xml:space="preserve">Terminal-style portfolio; a dependency-free Node.js build renders Markdown to static HTML, deployed via GitHub Actions.</w:t>
+        <w:t xml:space="preserve">A portfolio site that looks like a terminal. A small Node script turns Markdown into static HTML, and GitHub Actions deploys it.</w:t>
       </w:r>
     </w:p>
     <w:p>

</xml_diff>